<commit_message>
feat(physics): author units 00/03/04/05 + add visuals to Forces
Units 00 Math in Science (4), 03 Momentum & Impulse (4), 04 Energy (6),
05 Thermodynamics (3) authored as DOCX-only 5E lessons with embedded
charts/graphs/diagrams + unit plans. Forces retrofit with figures. All build
clean (Failed: 0).

Co-Authored-By: Claude Opus 4.8 <noreply@anthropic.com>
</commit_message>
<xml_diff>
--- a/Publisher_Ready_Curriculum/01_Physics_East_Meadow_Refactor/02_Forces/01_Newtons_First_Law_and_Inertia/Student_Notes.docx
+++ b/Publisher_Ready_Curriculum/01_Physics_East_Meadow_Refactor/02_Forces/01_Newtons_First_Law_and_Inertia/Student_Notes.docx
@@ -2,7 +2,7 @@
 <file path=word/document.xml><?xml version="1.0" encoding="utf-8"?>
 <w:document xmlns:w="http://schemas.openxmlformats.org/wordprocessingml/2006/main" xmlns:m="http://schemas.openxmlformats.org/officeDocument/2006/math" xmlns:r="http://schemas.openxmlformats.org/officeDocument/2006/relationships" xmlns:o="urn:schemas-microsoft-com:office:office" xmlns:v="urn:schemas-microsoft-com:vml" xmlns:w10="urn:schemas-microsoft-com:office:word" xmlns:a="http://schemas.openxmlformats.org/drawingml/2006/main" xmlns:pic="http://schemas.openxmlformats.org/drawingml/2006/picture" xmlns:wp="http://schemas.openxmlformats.org/drawingml/2006/wordprocessingDrawing">
   <w:body>
-    <w:bookmarkStart w:id="14" w:name="X63127439ebd29f3561127d4a2c3c0588ce76a7e"/>
+    <w:bookmarkStart w:id="20" w:name="X63127439ebd29f3561127d4a2c3c0588ce76a7e"/>
     <w:p>
       <w:pPr>
         <w:pStyle w:val="Heading1"/>
@@ -209,7 +209,7 @@
       </w:r>
     </w:p>
     <w:bookmarkEnd w:id="10"/>
-    <w:bookmarkStart w:id="11" w:name="guided-notes"/>
+    <w:bookmarkStart w:id="17" w:name="guided-notes"/>
     <w:p>
       <w:pPr>
         <w:pStyle w:val="Heading2"/>
@@ -407,14 +407,132 @@
       </w:r>
     </w:p>
     <w:p>
+      <w:pPr>
+        <w:pStyle w:val="CaptionedFigure"/>
+      </w:pPr>
+      <w:r>
+        <w:drawing>
+          <wp:inline>
+            <wp:extent cx="3803904" cy="3334512"/>
+            <wp:effectExtent b="0" l="0" r="0" t="0"/>
+            <wp:docPr descr="Free-body diagram of a book on a table with a downward gravity arrow and an equal upward normal-force arrow, showing the net force is zero." title="" id="12" name="Picture"/>
+            <a:graphic>
+              <a:graphicData uri="http://schemas.openxmlformats.org/drawingml/2006/picture">
+                <pic:pic>
+                  <pic:nvPicPr>
+                    <pic:cNvPr descr="figures/fbd_book_on_table.png" id="13" name="Picture"/>
+                    <pic:cNvPicPr>
+                      <a:picLocks noChangeArrowheads="1" noChangeAspect="1"/>
+                    </pic:cNvPicPr>
+                  </pic:nvPicPr>
+                  <pic:blipFill>
+                    <a:blip r:embed="rId11"/>
+                    <a:stretch>
+                      <a:fillRect/>
+                    </a:stretch>
+                  </pic:blipFill>
+                  <pic:spPr bwMode="auto">
+                    <a:xfrm>
+                      <a:off x="0" y="0"/>
+                      <a:ext cx="3803904" cy="3334512"/>
+                    </a:xfrm>
+                    <a:prstGeom prst="rect">
+                      <a:avLst/>
+                    </a:prstGeom>
+                    <a:noFill/>
+                    <a:ln w="9525">
+                      <a:noFill/>
+                      <a:headEnd/>
+                      <a:tailEnd/>
+                    </a:ln>
+                  </pic:spPr>
+                </pic:pic>
+              </a:graphicData>
+            </a:graphic>
+          </wp:inline>
+        </w:drawing>
+      </w:r>
+    </w:p>
+    <w:p>
+      <w:pPr>
+        <w:pStyle w:val="ImageCaption"/>
+      </w:pPr>
+      <w:r>
+        <w:t xml:space="preserve">Free-body diagram of a book on a table with a downward gravity arrow and an equal upward normal-force arrow, showing the net force is zero.</w:t>
+      </w:r>
+    </w:p>
+    <w:p>
+      <w:pPr>
+        <w:pStyle w:val="BodyText"/>
+      </w:pPr>
+      <w:r>
+        <w:t xml:space="preserve">When the net force is zero, velocity does not change. A moving object simply keeps its velocity — a flat line on a velocity–time graph:</w:t>
+      </w:r>
+    </w:p>
+    <w:p>
+      <w:pPr>
+        <w:pStyle w:val="CaptionedFigure"/>
+      </w:pPr>
+      <w:r>
+        <w:drawing>
+          <wp:inline>
+            <wp:extent cx="4108704" cy="3206496"/>
+            <wp:effectExtent b="0" l="0" r="0" t="0"/>
+            <wp:docPr descr="Velocity–time graph showing a horizontal line at constant velocity, illustrating that zero net force means no change in velocity." title="" id="15" name="Picture"/>
+            <a:graphic>
+              <a:graphicData uri="http://schemas.openxmlformats.org/drawingml/2006/picture">
+                <pic:pic>
+                  <pic:nvPicPr>
+                    <pic:cNvPr descr="figures/vt_constant_velocity.png" id="16" name="Picture"/>
+                    <pic:cNvPicPr>
+                      <a:picLocks noChangeArrowheads="1" noChangeAspect="1"/>
+                    </pic:cNvPicPr>
+                  </pic:nvPicPr>
+                  <pic:blipFill>
+                    <a:blip r:embed="rId14"/>
+                    <a:stretch>
+                      <a:fillRect/>
+                    </a:stretch>
+                  </pic:blipFill>
+                  <pic:spPr bwMode="auto">
+                    <a:xfrm>
+                      <a:off x="0" y="0"/>
+                      <a:ext cx="4108704" cy="3206496"/>
+                    </a:xfrm>
+                    <a:prstGeom prst="rect">
+                      <a:avLst/>
+                    </a:prstGeom>
+                    <a:noFill/>
+                    <a:ln w="9525">
+                      <a:noFill/>
+                      <a:headEnd/>
+                      <a:tailEnd/>
+                    </a:ln>
+                  </pic:spPr>
+                </pic:pic>
+              </a:graphicData>
+            </a:graphic>
+          </wp:inline>
+        </w:drawing>
+      </w:r>
+    </w:p>
+    <w:p>
+      <w:pPr>
+        <w:pStyle w:val="ImageCaption"/>
+      </w:pPr>
+      <w:r>
+        <w:t xml:space="preserve">Velocity–time graph showing a horizontal line at constant velocity, illustrating that zero net force means no change in velocity.</w:t>
+      </w:r>
+    </w:p>
+    <w:p>
       <w:r>
         <w:pict>
           <v:rect style="width:0;height:1.5pt" o:hralign="center" o:hrstd="t" o:hr="t"/>
         </w:pict>
       </w:r>
     </w:p>
-    <w:bookmarkEnd w:id="11"/>
-    <w:bookmarkStart w:id="12" w:name="worked-example"/>
+    <w:bookmarkEnd w:id="17"/>
+    <w:bookmarkStart w:id="18" w:name="worked-example"/>
     <w:p>
       <w:pPr>
         <w:pStyle w:val="Heading2"/>
@@ -494,8 +612,8 @@
         </w:pict>
       </w:r>
     </w:p>
-    <w:bookmarkEnd w:id="12"/>
-    <w:bookmarkStart w:id="13" w:name="summary"/>
+    <w:bookmarkEnd w:id="18"/>
+    <w:bookmarkStart w:id="19" w:name="summary"/>
     <w:p>
       <w:pPr>
         <w:pStyle w:val="Heading2"/>
@@ -538,8 +656,8 @@
         <w:t xml:space="preserve">so __________________________________________.</w:t>
       </w:r>
     </w:p>
-    <w:bookmarkEnd w:id="13"/>
-    <w:bookmarkEnd w:id="14"/>
+    <w:bookmarkEnd w:id="19"/>
+    <w:bookmarkEnd w:id="20"/>
     <w:sectPr>
       <w:pgSz w:h="15840" w:w="12240"/>
       <w:pgMar w:bottom="1152" w:footer="720" w:gutter="0" w:header="720" w:left="1296" w:right="1296" w:top="1152"/>

</xml_diff>